<commit_message>
Correzione lo precendente "avanzamento Assignment 1"
</commit_message>
<xml_diff>
--- a/ASSIGNMENTS/reports/Assignment1.docx
+++ b/ASSIGNMENTS/reports/Assignment1.docx
@@ -4481,6 +4481,9 @@
         </w:rPr>
       </w:pPr>
       <w:r>
+        <w:rPr>
+          <w:noProof/>
+        </w:rPr>
         <w:drawing>
           <wp:anchor distT="0" distB="0" distL="114300" distR="114300" simplePos="0" relativeHeight="251658240" behindDoc="0" locked="0" layoutInCell="1" allowOverlap="1" wp14:anchorId="5AC252CF" wp14:editId="41AC2AD9">
             <wp:simplePos x="0" y="0"/>
@@ -4539,6 +4542,7 @@
       </w:r>
       <w:r>
         <w:rPr>
+          <w:noProof/>
           <w:sz w:val="24"/>
           <w:szCs w:val="24"/>
         </w:rPr>
@@ -4908,8 +4912,6 @@
       </w:r>
       <w:r>
         <w:tab/>
-      </w:r>
-      <w:r>
         <w:t xml:space="preserve">Figure </w:t>
       </w:r>
       <w:r>
@@ -5729,6 +5731,286 @@
           <w:szCs w:val="24"/>
         </w:rPr>
         <w:t>.</w:t>
+      </w:r>
+    </w:p>
+    <w:p>
+      <w:pPr>
+        <w:rPr>
+          <w:sz w:val="24"/>
+          <w:szCs w:val="24"/>
+        </w:rPr>
+      </w:pPr>
+      <w:proofErr w:type="spellStart"/>
+      <w:r>
+        <w:rPr>
+          <w:sz w:val="24"/>
+          <w:szCs w:val="24"/>
+        </w:rPr>
+        <w:t>This</w:t>
+      </w:r>
+      <w:proofErr w:type="spellEnd"/>
+      <w:r>
+        <w:rPr>
+          <w:sz w:val="24"/>
+          <w:szCs w:val="24"/>
+        </w:rPr>
+        <w:t xml:space="preserve"> strong community </w:t>
+      </w:r>
+      <w:proofErr w:type="spellStart"/>
+      <w:r>
+        <w:rPr>
+          <w:sz w:val="24"/>
+          <w:szCs w:val="24"/>
+        </w:rPr>
+        <w:t>structure</w:t>
+      </w:r>
+      <w:proofErr w:type="spellEnd"/>
+      <w:r>
+        <w:rPr>
+          <w:sz w:val="24"/>
+          <w:szCs w:val="24"/>
+        </w:rPr>
+        <w:t xml:space="preserve"> </w:t>
+      </w:r>
+      <w:proofErr w:type="spellStart"/>
+      <w:r>
+        <w:rPr>
+          <w:sz w:val="24"/>
+          <w:szCs w:val="24"/>
+        </w:rPr>
+        <w:t>is</w:t>
+      </w:r>
+      <w:proofErr w:type="spellEnd"/>
+      <w:r>
+        <w:rPr>
+          <w:sz w:val="24"/>
+          <w:szCs w:val="24"/>
+        </w:rPr>
+        <w:t xml:space="preserve"> a </w:t>
+      </w:r>
+      <w:proofErr w:type="spellStart"/>
+      <w:r>
+        <w:rPr>
+          <w:sz w:val="24"/>
+          <w:szCs w:val="24"/>
+        </w:rPr>
+        <w:t>direct</w:t>
+      </w:r>
+      <w:proofErr w:type="spellEnd"/>
+      <w:r>
+        <w:rPr>
+          <w:sz w:val="24"/>
+          <w:szCs w:val="24"/>
+        </w:rPr>
+        <w:t xml:space="preserve"> </w:t>
+      </w:r>
+      <w:proofErr w:type="spellStart"/>
+      <w:r>
+        <w:rPr>
+          <w:sz w:val="24"/>
+          <w:szCs w:val="24"/>
+        </w:rPr>
+        <w:t>consequence</w:t>
+      </w:r>
+      <w:proofErr w:type="spellEnd"/>
+      <w:r>
+        <w:rPr>
+          <w:sz w:val="24"/>
+          <w:szCs w:val="24"/>
+        </w:rPr>
+        <w:t xml:space="preserve"> of the </w:t>
+      </w:r>
+      <w:proofErr w:type="spellStart"/>
+      <w:r>
+        <w:rPr>
+          <w:sz w:val="24"/>
+          <w:szCs w:val="24"/>
+        </w:rPr>
+        <w:t>graph</w:t>
+      </w:r>
+      <w:proofErr w:type="spellEnd"/>
+      <w:r>
+        <w:rPr>
+          <w:sz w:val="24"/>
+          <w:szCs w:val="24"/>
+        </w:rPr>
+        <w:t xml:space="preserve"> </w:t>
+      </w:r>
+      <w:proofErr w:type="spellStart"/>
+      <w:r>
+        <w:rPr>
+          <w:sz w:val="24"/>
+          <w:szCs w:val="24"/>
+        </w:rPr>
+        <w:t>construction</w:t>
+      </w:r>
+      <w:proofErr w:type="spellEnd"/>
+      <w:r>
+        <w:rPr>
+          <w:sz w:val="24"/>
+          <w:szCs w:val="24"/>
+        </w:rPr>
+        <w:t xml:space="preserve"> </w:t>
+      </w:r>
+      <w:proofErr w:type="spellStart"/>
+      <w:r>
+        <w:rPr>
+          <w:sz w:val="24"/>
+          <w:szCs w:val="24"/>
+        </w:rPr>
+        <w:t>mechanism</w:t>
+      </w:r>
+      <w:proofErr w:type="spellEnd"/>
+      <w:r>
+        <w:rPr>
+          <w:sz w:val="24"/>
+          <w:szCs w:val="24"/>
+        </w:rPr>
+        <w:t xml:space="preserve"> </w:t>
+      </w:r>
+      <w:proofErr w:type="spellStart"/>
+      <w:r>
+        <w:rPr>
+          <w:sz w:val="24"/>
+          <w:szCs w:val="24"/>
+        </w:rPr>
+        <w:t>based</w:t>
+      </w:r>
+      <w:proofErr w:type="spellEnd"/>
+      <w:r>
+        <w:rPr>
+          <w:sz w:val="24"/>
+          <w:szCs w:val="24"/>
+        </w:rPr>
+        <w:t xml:space="preserve"> on </w:t>
+      </w:r>
+      <w:proofErr w:type="spellStart"/>
+      <w:r>
+        <w:rPr>
+          <w:sz w:val="24"/>
+          <w:szCs w:val="24"/>
+        </w:rPr>
+        <w:t>shared</w:t>
+      </w:r>
+      <w:proofErr w:type="spellEnd"/>
+      <w:r>
+        <w:rPr>
+          <w:sz w:val="24"/>
+          <w:szCs w:val="24"/>
+        </w:rPr>
+        <w:t xml:space="preserve"> </w:t>
+      </w:r>
+      <w:proofErr w:type="spellStart"/>
+      <w:r>
+        <w:rPr>
+          <w:sz w:val="24"/>
+          <w:szCs w:val="24"/>
+        </w:rPr>
+        <w:t>genre</w:t>
+      </w:r>
+      <w:proofErr w:type="spellEnd"/>
+      <w:r>
+        <w:rPr>
+          <w:sz w:val="24"/>
+          <w:szCs w:val="24"/>
+        </w:rPr>
+        <w:t xml:space="preserve"> </w:t>
+      </w:r>
+      <w:proofErr w:type="spellStart"/>
+      <w:r>
+        <w:rPr>
+          <w:sz w:val="24"/>
+          <w:szCs w:val="24"/>
+        </w:rPr>
+        <w:t>overlap</w:t>
+      </w:r>
+      <w:proofErr w:type="spellEnd"/>
+      <w:r>
+        <w:rPr>
+          <w:sz w:val="24"/>
+          <w:szCs w:val="24"/>
+        </w:rPr>
+        <w:t xml:space="preserve">, </w:t>
+      </w:r>
+      <w:proofErr w:type="spellStart"/>
+      <w:r>
+        <w:rPr>
+          <w:sz w:val="24"/>
+          <w:szCs w:val="24"/>
+        </w:rPr>
+        <w:t>which</w:t>
+      </w:r>
+      <w:proofErr w:type="spellEnd"/>
+      <w:r>
+        <w:rPr>
+          <w:sz w:val="24"/>
+          <w:szCs w:val="24"/>
+        </w:rPr>
+        <w:t xml:space="preserve"> </w:t>
+      </w:r>
+      <w:proofErr w:type="spellStart"/>
+      <w:r>
+        <w:rPr>
+          <w:sz w:val="24"/>
+          <w:szCs w:val="24"/>
+        </w:rPr>
+        <w:t>naturally</w:t>
+      </w:r>
+      <w:proofErr w:type="spellEnd"/>
+      <w:r>
+        <w:rPr>
+          <w:sz w:val="24"/>
+          <w:szCs w:val="24"/>
+        </w:rPr>
+        <w:t xml:space="preserve"> </w:t>
+      </w:r>
+      <w:proofErr w:type="spellStart"/>
+      <w:r>
+        <w:rPr>
+          <w:sz w:val="24"/>
+          <w:szCs w:val="24"/>
+        </w:rPr>
+        <w:t>induces</w:t>
+      </w:r>
+      <w:proofErr w:type="spellEnd"/>
+      <w:r>
+        <w:rPr>
+          <w:sz w:val="24"/>
+          <w:szCs w:val="24"/>
+        </w:rPr>
+        <w:t xml:space="preserve"> </w:t>
+      </w:r>
+      <w:proofErr w:type="spellStart"/>
+      <w:r>
+        <w:rPr>
+          <w:sz w:val="24"/>
+          <w:szCs w:val="24"/>
+        </w:rPr>
+        <w:t>densely</w:t>
+      </w:r>
+      <w:proofErr w:type="spellEnd"/>
+      <w:r>
+        <w:rPr>
+          <w:sz w:val="24"/>
+          <w:szCs w:val="24"/>
+        </w:rPr>
+        <w:t xml:space="preserve"> </w:t>
+      </w:r>
+      <w:proofErr w:type="spellStart"/>
+      <w:r>
+        <w:rPr>
+          <w:sz w:val="24"/>
+          <w:szCs w:val="24"/>
+        </w:rPr>
+        <w:t>connected</w:t>
+      </w:r>
+      <w:proofErr w:type="spellEnd"/>
+      <w:r>
+        <w:rPr>
+          <w:sz w:val="24"/>
+          <w:szCs w:val="24"/>
+        </w:rPr>
+        <w:t xml:space="preserve"> clusters.</w:t>
       </w:r>
     </w:p>
     <w:p>

</xml_diff>

<commit_message>
Correzione report assgnment 1
</commit_message>
<xml_diff>
--- a/ASSIGNMENTS/reports/Assignment1.docx
+++ b/ASSIGNMENTS/reports/Assignment1.docx
@@ -3154,6 +3154,343 @@
     </w:p>
     <w:p>
       <w:pPr>
+        <w:pStyle w:val="Nessunaspaziatura"/>
+        <w:spacing w:before="240" w:after="240"/>
+        <w:rPr>
+          <w:sz w:val="24"/>
+          <w:szCs w:val="24"/>
+        </w:rPr>
+      </w:pPr>
+      <w:r>
+        <w:rPr>
+          <w:sz w:val="24"/>
+          <w:szCs w:val="24"/>
+        </w:rPr>
+        <w:t xml:space="preserve">Due to the </w:t>
+      </w:r>
+      <w:proofErr w:type="spellStart"/>
+      <w:r>
+        <w:rPr>
+          <w:sz w:val="24"/>
+          <w:szCs w:val="24"/>
+        </w:rPr>
+        <w:t>computational</w:t>
+      </w:r>
+      <w:proofErr w:type="spellEnd"/>
+      <w:r>
+        <w:rPr>
+          <w:sz w:val="24"/>
+          <w:szCs w:val="24"/>
+        </w:rPr>
+        <w:t xml:space="preserve"> </w:t>
+      </w:r>
+      <w:proofErr w:type="spellStart"/>
+      <w:r>
+        <w:rPr>
+          <w:sz w:val="24"/>
+          <w:szCs w:val="24"/>
+        </w:rPr>
+        <w:t>complexity</w:t>
+      </w:r>
+      <w:proofErr w:type="spellEnd"/>
+      <w:r>
+        <w:rPr>
+          <w:sz w:val="24"/>
+          <w:szCs w:val="24"/>
+        </w:rPr>
+        <w:t xml:space="preserve"> of the </w:t>
+      </w:r>
+      <w:proofErr w:type="spellStart"/>
+      <w:r>
+        <w:rPr>
+          <w:sz w:val="24"/>
+          <w:szCs w:val="24"/>
+        </w:rPr>
+        <w:t>Girvan</w:t>
+      </w:r>
+      <w:proofErr w:type="spellEnd"/>
+      <w:r>
+        <w:rPr>
+          <w:sz w:val="24"/>
+          <w:szCs w:val="24"/>
+        </w:rPr>
+        <w:t xml:space="preserve">–Newman </w:t>
+      </w:r>
+      <w:proofErr w:type="spellStart"/>
+      <w:r>
+        <w:rPr>
+          <w:sz w:val="24"/>
+          <w:szCs w:val="24"/>
+        </w:rPr>
+        <w:t>algorithm</w:t>
+      </w:r>
+      <w:proofErr w:type="spellEnd"/>
+      <w:r>
+        <w:rPr>
+          <w:sz w:val="24"/>
+          <w:szCs w:val="24"/>
+        </w:rPr>
+        <w:t xml:space="preserve">, </w:t>
+      </w:r>
+      <w:proofErr w:type="spellStart"/>
+      <w:r>
+        <w:rPr>
+          <w:sz w:val="24"/>
+          <w:szCs w:val="24"/>
+        </w:rPr>
+        <w:t>it</w:t>
+      </w:r>
+      <w:proofErr w:type="spellEnd"/>
+      <w:r>
+        <w:rPr>
+          <w:sz w:val="24"/>
+          <w:szCs w:val="24"/>
+        </w:rPr>
+        <w:t xml:space="preserve"> </w:t>
+      </w:r>
+      <w:proofErr w:type="spellStart"/>
+      <w:r>
+        <w:rPr>
+          <w:sz w:val="24"/>
+          <w:szCs w:val="24"/>
+        </w:rPr>
+        <w:t>was</w:t>
+      </w:r>
+      <w:proofErr w:type="spellEnd"/>
+      <w:r>
+        <w:rPr>
+          <w:sz w:val="24"/>
+          <w:szCs w:val="24"/>
+        </w:rPr>
+        <w:t xml:space="preserve"> </w:t>
+      </w:r>
+      <w:proofErr w:type="spellStart"/>
+      <w:r>
+        <w:rPr>
+          <w:sz w:val="24"/>
+          <w:szCs w:val="24"/>
+        </w:rPr>
+        <w:t>applied</w:t>
+      </w:r>
+      <w:proofErr w:type="spellEnd"/>
+      <w:r>
+        <w:rPr>
+          <w:sz w:val="24"/>
+          <w:szCs w:val="24"/>
+        </w:rPr>
+        <w:t xml:space="preserve"> </w:t>
+      </w:r>
+      <w:proofErr w:type="spellStart"/>
+      <w:r>
+        <w:rPr>
+          <w:sz w:val="24"/>
+          <w:szCs w:val="24"/>
+        </w:rPr>
+        <w:t>only</w:t>
+      </w:r>
+      <w:proofErr w:type="spellEnd"/>
+      <w:r>
+        <w:rPr>
+          <w:sz w:val="24"/>
+          <w:szCs w:val="24"/>
+        </w:rPr>
+        <w:t xml:space="preserve"> on a </w:t>
+      </w:r>
+      <w:proofErr w:type="spellStart"/>
+      <w:r>
+        <w:rPr>
+          <w:sz w:val="24"/>
+          <w:szCs w:val="24"/>
+        </w:rPr>
+        <w:t>reduced</w:t>
+      </w:r>
+      <w:proofErr w:type="spellEnd"/>
+      <w:r>
+        <w:rPr>
+          <w:sz w:val="24"/>
+          <w:szCs w:val="24"/>
+        </w:rPr>
+        <w:t xml:space="preserve"> </w:t>
+      </w:r>
+      <w:proofErr w:type="spellStart"/>
+      <w:r>
+        <w:rPr>
+          <w:sz w:val="24"/>
+          <w:szCs w:val="24"/>
+        </w:rPr>
+        <w:t>subgraph</w:t>
+      </w:r>
+      <w:proofErr w:type="spellEnd"/>
+      <w:r>
+        <w:rPr>
+          <w:sz w:val="24"/>
+          <w:szCs w:val="24"/>
+        </w:rPr>
+        <w:t xml:space="preserve"> of the </w:t>
+      </w:r>
+      <w:proofErr w:type="spellStart"/>
+      <w:r>
+        <w:rPr>
+          <w:sz w:val="24"/>
+          <w:szCs w:val="24"/>
+        </w:rPr>
+        <w:t>original</w:t>
+      </w:r>
+      <w:proofErr w:type="spellEnd"/>
+      <w:r>
+        <w:rPr>
+          <w:sz w:val="24"/>
+          <w:szCs w:val="24"/>
+        </w:rPr>
+        <w:t xml:space="preserve"> network, </w:t>
+      </w:r>
+      <w:proofErr w:type="spellStart"/>
+      <w:r>
+        <w:rPr>
+          <w:sz w:val="24"/>
+          <w:szCs w:val="24"/>
+        </w:rPr>
+        <w:t>as</w:t>
+      </w:r>
+      <w:proofErr w:type="spellEnd"/>
+      <w:r>
+        <w:rPr>
+          <w:sz w:val="24"/>
+          <w:szCs w:val="24"/>
+        </w:rPr>
+        <w:t xml:space="preserve"> </w:t>
+      </w:r>
+      <w:proofErr w:type="spellStart"/>
+      <w:r>
+        <w:rPr>
+          <w:sz w:val="24"/>
+          <w:szCs w:val="24"/>
+        </w:rPr>
+        <w:t>its</w:t>
+      </w:r>
+      <w:proofErr w:type="spellEnd"/>
+      <w:r>
+        <w:rPr>
+          <w:sz w:val="24"/>
+          <w:szCs w:val="24"/>
+        </w:rPr>
+        <w:t xml:space="preserve"> </w:t>
+      </w:r>
+      <w:proofErr w:type="spellStart"/>
+      <w:r>
+        <w:rPr>
+          <w:sz w:val="24"/>
+          <w:szCs w:val="24"/>
+        </w:rPr>
+        <w:t>execution</w:t>
+      </w:r>
+      <w:proofErr w:type="spellEnd"/>
+      <w:r>
+        <w:rPr>
+          <w:sz w:val="24"/>
+          <w:szCs w:val="24"/>
+        </w:rPr>
+        <w:t xml:space="preserve"> on the full </w:t>
+      </w:r>
+      <w:proofErr w:type="spellStart"/>
+      <w:r>
+        <w:rPr>
+          <w:sz w:val="24"/>
+          <w:szCs w:val="24"/>
+        </w:rPr>
+        <w:t>graph</w:t>
+      </w:r>
+      <w:proofErr w:type="spellEnd"/>
+      <w:r>
+        <w:rPr>
+          <w:sz w:val="24"/>
+          <w:szCs w:val="24"/>
+        </w:rPr>
+        <w:t xml:space="preserve"> </w:t>
+      </w:r>
+      <w:proofErr w:type="spellStart"/>
+      <w:r>
+        <w:rPr>
+          <w:sz w:val="24"/>
+          <w:szCs w:val="24"/>
+        </w:rPr>
+        <w:t>would</w:t>
+      </w:r>
+      <w:proofErr w:type="spellEnd"/>
+      <w:r>
+        <w:rPr>
+          <w:sz w:val="24"/>
+          <w:szCs w:val="24"/>
+        </w:rPr>
+        <w:t xml:space="preserve"> be </w:t>
+      </w:r>
+      <w:proofErr w:type="spellStart"/>
+      <w:r>
+        <w:rPr>
+          <w:sz w:val="24"/>
+          <w:szCs w:val="24"/>
+        </w:rPr>
+        <w:t>prohibitively</w:t>
+      </w:r>
+      <w:proofErr w:type="spellEnd"/>
+      <w:r>
+        <w:rPr>
+          <w:sz w:val="24"/>
+          <w:szCs w:val="24"/>
+        </w:rPr>
+        <w:t xml:space="preserve"> </w:t>
+      </w:r>
+      <w:proofErr w:type="spellStart"/>
+      <w:r>
+        <w:rPr>
+          <w:sz w:val="24"/>
+          <w:szCs w:val="24"/>
+        </w:rPr>
+        <w:t>expensive</w:t>
+      </w:r>
+      <w:proofErr w:type="spellEnd"/>
+      <w:r>
+        <w:rPr>
+          <w:sz w:val="24"/>
+          <w:szCs w:val="24"/>
+        </w:rPr>
+        <w:t xml:space="preserve"> in </w:t>
+      </w:r>
+      <w:proofErr w:type="spellStart"/>
+      <w:r>
+        <w:rPr>
+          <w:sz w:val="24"/>
+          <w:szCs w:val="24"/>
+        </w:rPr>
+        <w:t>terms</w:t>
+      </w:r>
+      <w:proofErr w:type="spellEnd"/>
+      <w:r>
+        <w:rPr>
+          <w:sz w:val="24"/>
+          <w:szCs w:val="24"/>
+        </w:rPr>
+        <w:t xml:space="preserve"> of time and </w:t>
+      </w:r>
+      <w:proofErr w:type="spellStart"/>
+      <w:r>
+        <w:rPr>
+          <w:sz w:val="24"/>
+          <w:szCs w:val="24"/>
+        </w:rPr>
+        <w:t>memory</w:t>
+      </w:r>
+      <w:proofErr w:type="spellEnd"/>
+      <w:r>
+        <w:rPr>
+          <w:sz w:val="24"/>
+          <w:szCs w:val="24"/>
+        </w:rPr>
+        <w:t>.</w:t>
+      </w:r>
+    </w:p>
+    <w:p>
+      <w:pPr>
         <w:rPr>
           <w:sz w:val="24"/>
           <w:szCs w:val="24"/>
@@ -4936,6 +5273,8 @@
         <w:t>: Leiden Communities</w:t>
       </w:r>
     </w:p>
+    <w:p/>
+    <w:p/>
     <w:p>
       <w:pPr>
         <w:pStyle w:val="Titolo2"/>
@@ -4954,6 +5293,7 @@
           <w:b/>
           <w:bCs/>
         </w:rPr>
+        <w:lastRenderedPageBreak/>
         <w:t>Discussion</w:t>
       </w:r>
       <w:proofErr w:type="spellEnd"/>
@@ -5553,7 +5893,6 @@
           <w:sz w:val="24"/>
           <w:szCs w:val="24"/>
         </w:rPr>
-        <w:lastRenderedPageBreak/>
         <w:t xml:space="preserve">Overall, the </w:t>
       </w:r>
       <w:proofErr w:type="spellStart"/>

</xml_diff>

<commit_message>
Correzioni per avanzamento assignment 2
</commit_message>
<xml_diff>
--- a/ASSIGNMENTS/reports/Assignment1.docx
+++ b/ASSIGNMENTS/reports/Assignment1.docx
@@ -1181,6 +1181,7 @@
     <w:p>
       <w:pPr>
         <w:pStyle w:val="Nessunaspaziatura"/>
+        <w:spacing w:before="240"/>
         <w:rPr>
           <w:sz w:val="24"/>
           <w:szCs w:val="24"/>
@@ -1239,6 +1240,22 @@
           <w:sz w:val="24"/>
           <w:szCs w:val="24"/>
         </w:rPr>
+        <w:t xml:space="preserve"> </w:t>
+      </w:r>
+      <w:proofErr w:type="spellStart"/>
+      <w:r>
+        <w:rPr>
+          <w:sz w:val="24"/>
+          <w:szCs w:val="24"/>
+        </w:rPr>
+        <w:t>only</w:t>
+      </w:r>
+      <w:proofErr w:type="spellEnd"/>
+      <w:r>
+        <w:rPr>
+          <w:sz w:val="24"/>
+          <w:szCs w:val="24"/>
+        </w:rPr>
         <w:t xml:space="preserve"> on a </w:t>
       </w:r>
       <w:proofErr w:type="spellStart"/>
@@ -1271,7 +1288,39 @@
           <w:sz w:val="24"/>
           <w:szCs w:val="24"/>
         </w:rPr>
-        <w:t xml:space="preserve"> due to </w:t>
+        <w:t xml:space="preserve"> of the </w:t>
+      </w:r>
+      <w:proofErr w:type="spellStart"/>
+      <w:r>
+        <w:rPr>
+          <w:sz w:val="24"/>
+          <w:szCs w:val="24"/>
+        </w:rPr>
+        <w:t>original</w:t>
+      </w:r>
+      <w:proofErr w:type="spellEnd"/>
+      <w:r>
+        <w:rPr>
+          <w:sz w:val="24"/>
+          <w:szCs w:val="24"/>
+        </w:rPr>
+        <w:t xml:space="preserve"> network, </w:t>
+      </w:r>
+      <w:proofErr w:type="spellStart"/>
+      <w:r>
+        <w:rPr>
+          <w:sz w:val="24"/>
+          <w:szCs w:val="24"/>
+        </w:rPr>
+        <w:t>as</w:t>
+      </w:r>
+      <w:proofErr w:type="spellEnd"/>
+      <w:r>
+        <w:rPr>
+          <w:sz w:val="24"/>
+          <w:szCs w:val="24"/>
+        </w:rPr>
+        <w:t xml:space="preserve"> </w:t>
       </w:r>
       <w:proofErr w:type="spellStart"/>
       <w:r>
@@ -1295,23 +1344,103 @@
           <w:sz w:val="24"/>
           <w:szCs w:val="24"/>
         </w:rPr>
-        <w:t>computational</w:t>
-      </w:r>
-      <w:proofErr w:type="spellEnd"/>
-      <w:r>
-        <w:rPr>
-          <w:sz w:val="24"/>
-          <w:szCs w:val="24"/>
-        </w:rPr>
-        <w:t xml:space="preserve"> </w:t>
-      </w:r>
-      <w:proofErr w:type="spellStart"/>
-      <w:r>
-        <w:rPr>
-          <w:sz w:val="24"/>
-          <w:szCs w:val="24"/>
-        </w:rPr>
-        <w:t>complexity</w:t>
+        <w:t>execution</w:t>
+      </w:r>
+      <w:proofErr w:type="spellEnd"/>
+      <w:r>
+        <w:rPr>
+          <w:sz w:val="24"/>
+          <w:szCs w:val="24"/>
+        </w:rPr>
+        <w:t xml:space="preserve"> on the full </w:t>
+      </w:r>
+      <w:proofErr w:type="spellStart"/>
+      <w:r>
+        <w:rPr>
+          <w:sz w:val="24"/>
+          <w:szCs w:val="24"/>
+        </w:rPr>
+        <w:t>graph</w:t>
+      </w:r>
+      <w:proofErr w:type="spellEnd"/>
+      <w:r>
+        <w:rPr>
+          <w:sz w:val="24"/>
+          <w:szCs w:val="24"/>
+        </w:rPr>
+        <w:t xml:space="preserve"> </w:t>
+      </w:r>
+      <w:proofErr w:type="spellStart"/>
+      <w:r>
+        <w:rPr>
+          <w:sz w:val="24"/>
+          <w:szCs w:val="24"/>
+        </w:rPr>
+        <w:t>would</w:t>
+      </w:r>
+      <w:proofErr w:type="spellEnd"/>
+      <w:r>
+        <w:rPr>
+          <w:sz w:val="24"/>
+          <w:szCs w:val="24"/>
+        </w:rPr>
+        <w:t xml:space="preserve"> be </w:t>
+      </w:r>
+      <w:proofErr w:type="spellStart"/>
+      <w:r>
+        <w:rPr>
+          <w:sz w:val="24"/>
+          <w:szCs w:val="24"/>
+        </w:rPr>
+        <w:t>prohibitively</w:t>
+      </w:r>
+      <w:proofErr w:type="spellEnd"/>
+      <w:r>
+        <w:rPr>
+          <w:sz w:val="24"/>
+          <w:szCs w:val="24"/>
+        </w:rPr>
+        <w:t xml:space="preserve"> </w:t>
+      </w:r>
+      <w:proofErr w:type="spellStart"/>
+      <w:r>
+        <w:rPr>
+          <w:sz w:val="24"/>
+          <w:szCs w:val="24"/>
+        </w:rPr>
+        <w:t>expensive</w:t>
+      </w:r>
+      <w:proofErr w:type="spellEnd"/>
+      <w:r>
+        <w:rPr>
+          <w:sz w:val="24"/>
+          <w:szCs w:val="24"/>
+        </w:rPr>
+        <w:t xml:space="preserve"> in </w:t>
+      </w:r>
+      <w:proofErr w:type="spellStart"/>
+      <w:r>
+        <w:rPr>
+          <w:sz w:val="24"/>
+          <w:szCs w:val="24"/>
+        </w:rPr>
+        <w:t>terms</w:t>
+      </w:r>
+      <w:proofErr w:type="spellEnd"/>
+      <w:r>
+        <w:rPr>
+          <w:sz w:val="24"/>
+          <w:szCs w:val="24"/>
+        </w:rPr>
+        <w:t xml:space="preserve"> of time and </w:t>
+      </w:r>
+      <w:proofErr w:type="spellStart"/>
+      <w:r>
+        <w:rPr>
+          <w:sz w:val="24"/>
+          <w:szCs w:val="24"/>
+        </w:rPr>
+        <w:t>memory</w:t>
       </w:r>
       <w:proofErr w:type="spellEnd"/>
       <w:r>
@@ -3154,343 +3283,7 @@
     </w:p>
     <w:p>
       <w:pPr>
-        <w:pStyle w:val="Nessunaspaziatura"/>
-        <w:spacing w:before="240" w:after="240"/>
-        <w:rPr>
-          <w:sz w:val="24"/>
-          <w:szCs w:val="24"/>
-        </w:rPr>
-      </w:pPr>
-      <w:r>
-        <w:rPr>
-          <w:sz w:val="24"/>
-          <w:szCs w:val="24"/>
-        </w:rPr>
-        <w:t xml:space="preserve">Due to the </w:t>
-      </w:r>
-      <w:proofErr w:type="spellStart"/>
-      <w:r>
-        <w:rPr>
-          <w:sz w:val="24"/>
-          <w:szCs w:val="24"/>
-        </w:rPr>
-        <w:t>computational</w:t>
-      </w:r>
-      <w:proofErr w:type="spellEnd"/>
-      <w:r>
-        <w:rPr>
-          <w:sz w:val="24"/>
-          <w:szCs w:val="24"/>
-        </w:rPr>
-        <w:t xml:space="preserve"> </w:t>
-      </w:r>
-      <w:proofErr w:type="spellStart"/>
-      <w:r>
-        <w:rPr>
-          <w:sz w:val="24"/>
-          <w:szCs w:val="24"/>
-        </w:rPr>
-        <w:t>complexity</w:t>
-      </w:r>
-      <w:proofErr w:type="spellEnd"/>
-      <w:r>
-        <w:rPr>
-          <w:sz w:val="24"/>
-          <w:szCs w:val="24"/>
-        </w:rPr>
-        <w:t xml:space="preserve"> of the </w:t>
-      </w:r>
-      <w:proofErr w:type="spellStart"/>
-      <w:r>
-        <w:rPr>
-          <w:sz w:val="24"/>
-          <w:szCs w:val="24"/>
-        </w:rPr>
-        <w:t>Girvan</w:t>
-      </w:r>
-      <w:proofErr w:type="spellEnd"/>
-      <w:r>
-        <w:rPr>
-          <w:sz w:val="24"/>
-          <w:szCs w:val="24"/>
-        </w:rPr>
-        <w:t xml:space="preserve">–Newman </w:t>
-      </w:r>
-      <w:proofErr w:type="spellStart"/>
-      <w:r>
-        <w:rPr>
-          <w:sz w:val="24"/>
-          <w:szCs w:val="24"/>
-        </w:rPr>
-        <w:t>algorithm</w:t>
-      </w:r>
-      <w:proofErr w:type="spellEnd"/>
-      <w:r>
-        <w:rPr>
-          <w:sz w:val="24"/>
-          <w:szCs w:val="24"/>
-        </w:rPr>
-        <w:t xml:space="preserve">, </w:t>
-      </w:r>
-      <w:proofErr w:type="spellStart"/>
-      <w:r>
-        <w:rPr>
-          <w:sz w:val="24"/>
-          <w:szCs w:val="24"/>
-        </w:rPr>
-        <w:t>it</w:t>
-      </w:r>
-      <w:proofErr w:type="spellEnd"/>
-      <w:r>
-        <w:rPr>
-          <w:sz w:val="24"/>
-          <w:szCs w:val="24"/>
-        </w:rPr>
-        <w:t xml:space="preserve"> </w:t>
-      </w:r>
-      <w:proofErr w:type="spellStart"/>
-      <w:r>
-        <w:rPr>
-          <w:sz w:val="24"/>
-          <w:szCs w:val="24"/>
-        </w:rPr>
-        <w:t>was</w:t>
-      </w:r>
-      <w:proofErr w:type="spellEnd"/>
-      <w:r>
-        <w:rPr>
-          <w:sz w:val="24"/>
-          <w:szCs w:val="24"/>
-        </w:rPr>
-        <w:t xml:space="preserve"> </w:t>
-      </w:r>
-      <w:proofErr w:type="spellStart"/>
-      <w:r>
-        <w:rPr>
-          <w:sz w:val="24"/>
-          <w:szCs w:val="24"/>
-        </w:rPr>
-        <w:t>applied</w:t>
-      </w:r>
-      <w:proofErr w:type="spellEnd"/>
-      <w:r>
-        <w:rPr>
-          <w:sz w:val="24"/>
-          <w:szCs w:val="24"/>
-        </w:rPr>
-        <w:t xml:space="preserve"> </w:t>
-      </w:r>
-      <w:proofErr w:type="spellStart"/>
-      <w:r>
-        <w:rPr>
-          <w:sz w:val="24"/>
-          <w:szCs w:val="24"/>
-        </w:rPr>
-        <w:t>only</w:t>
-      </w:r>
-      <w:proofErr w:type="spellEnd"/>
-      <w:r>
-        <w:rPr>
-          <w:sz w:val="24"/>
-          <w:szCs w:val="24"/>
-        </w:rPr>
-        <w:t xml:space="preserve"> on a </w:t>
-      </w:r>
-      <w:proofErr w:type="spellStart"/>
-      <w:r>
-        <w:rPr>
-          <w:sz w:val="24"/>
-          <w:szCs w:val="24"/>
-        </w:rPr>
-        <w:t>reduced</w:t>
-      </w:r>
-      <w:proofErr w:type="spellEnd"/>
-      <w:r>
-        <w:rPr>
-          <w:sz w:val="24"/>
-          <w:szCs w:val="24"/>
-        </w:rPr>
-        <w:t xml:space="preserve"> </w:t>
-      </w:r>
-      <w:proofErr w:type="spellStart"/>
-      <w:r>
-        <w:rPr>
-          <w:sz w:val="24"/>
-          <w:szCs w:val="24"/>
-        </w:rPr>
-        <w:t>subgraph</w:t>
-      </w:r>
-      <w:proofErr w:type="spellEnd"/>
-      <w:r>
-        <w:rPr>
-          <w:sz w:val="24"/>
-          <w:szCs w:val="24"/>
-        </w:rPr>
-        <w:t xml:space="preserve"> of the </w:t>
-      </w:r>
-      <w:proofErr w:type="spellStart"/>
-      <w:r>
-        <w:rPr>
-          <w:sz w:val="24"/>
-          <w:szCs w:val="24"/>
-        </w:rPr>
-        <w:t>original</w:t>
-      </w:r>
-      <w:proofErr w:type="spellEnd"/>
-      <w:r>
-        <w:rPr>
-          <w:sz w:val="24"/>
-          <w:szCs w:val="24"/>
-        </w:rPr>
-        <w:t xml:space="preserve"> network, </w:t>
-      </w:r>
-      <w:proofErr w:type="spellStart"/>
-      <w:r>
-        <w:rPr>
-          <w:sz w:val="24"/>
-          <w:szCs w:val="24"/>
-        </w:rPr>
-        <w:t>as</w:t>
-      </w:r>
-      <w:proofErr w:type="spellEnd"/>
-      <w:r>
-        <w:rPr>
-          <w:sz w:val="24"/>
-          <w:szCs w:val="24"/>
-        </w:rPr>
-        <w:t xml:space="preserve"> </w:t>
-      </w:r>
-      <w:proofErr w:type="spellStart"/>
-      <w:r>
-        <w:rPr>
-          <w:sz w:val="24"/>
-          <w:szCs w:val="24"/>
-        </w:rPr>
-        <w:t>its</w:t>
-      </w:r>
-      <w:proofErr w:type="spellEnd"/>
-      <w:r>
-        <w:rPr>
-          <w:sz w:val="24"/>
-          <w:szCs w:val="24"/>
-        </w:rPr>
-        <w:t xml:space="preserve"> </w:t>
-      </w:r>
-      <w:proofErr w:type="spellStart"/>
-      <w:r>
-        <w:rPr>
-          <w:sz w:val="24"/>
-          <w:szCs w:val="24"/>
-        </w:rPr>
-        <w:t>execution</w:t>
-      </w:r>
-      <w:proofErr w:type="spellEnd"/>
-      <w:r>
-        <w:rPr>
-          <w:sz w:val="24"/>
-          <w:szCs w:val="24"/>
-        </w:rPr>
-        <w:t xml:space="preserve"> on the full </w:t>
-      </w:r>
-      <w:proofErr w:type="spellStart"/>
-      <w:r>
-        <w:rPr>
-          <w:sz w:val="24"/>
-          <w:szCs w:val="24"/>
-        </w:rPr>
-        <w:t>graph</w:t>
-      </w:r>
-      <w:proofErr w:type="spellEnd"/>
-      <w:r>
-        <w:rPr>
-          <w:sz w:val="24"/>
-          <w:szCs w:val="24"/>
-        </w:rPr>
-        <w:t xml:space="preserve"> </w:t>
-      </w:r>
-      <w:proofErr w:type="spellStart"/>
-      <w:r>
-        <w:rPr>
-          <w:sz w:val="24"/>
-          <w:szCs w:val="24"/>
-        </w:rPr>
-        <w:t>would</w:t>
-      </w:r>
-      <w:proofErr w:type="spellEnd"/>
-      <w:r>
-        <w:rPr>
-          <w:sz w:val="24"/>
-          <w:szCs w:val="24"/>
-        </w:rPr>
-        <w:t xml:space="preserve"> be </w:t>
-      </w:r>
-      <w:proofErr w:type="spellStart"/>
-      <w:r>
-        <w:rPr>
-          <w:sz w:val="24"/>
-          <w:szCs w:val="24"/>
-        </w:rPr>
-        <w:t>prohibitively</w:t>
-      </w:r>
-      <w:proofErr w:type="spellEnd"/>
-      <w:r>
-        <w:rPr>
-          <w:sz w:val="24"/>
-          <w:szCs w:val="24"/>
-        </w:rPr>
-        <w:t xml:space="preserve"> </w:t>
-      </w:r>
-      <w:proofErr w:type="spellStart"/>
-      <w:r>
-        <w:rPr>
-          <w:sz w:val="24"/>
-          <w:szCs w:val="24"/>
-        </w:rPr>
-        <w:t>expensive</w:t>
-      </w:r>
-      <w:proofErr w:type="spellEnd"/>
-      <w:r>
-        <w:rPr>
-          <w:sz w:val="24"/>
-          <w:szCs w:val="24"/>
-        </w:rPr>
-        <w:t xml:space="preserve"> in </w:t>
-      </w:r>
-      <w:proofErr w:type="spellStart"/>
-      <w:r>
-        <w:rPr>
-          <w:sz w:val="24"/>
-          <w:szCs w:val="24"/>
-        </w:rPr>
-        <w:t>terms</w:t>
-      </w:r>
-      <w:proofErr w:type="spellEnd"/>
-      <w:r>
-        <w:rPr>
-          <w:sz w:val="24"/>
-          <w:szCs w:val="24"/>
-        </w:rPr>
-        <w:t xml:space="preserve"> of time and </w:t>
-      </w:r>
-      <w:proofErr w:type="spellStart"/>
-      <w:r>
-        <w:rPr>
-          <w:sz w:val="24"/>
-          <w:szCs w:val="24"/>
-        </w:rPr>
-        <w:t>memory</w:t>
-      </w:r>
-      <w:proofErr w:type="spellEnd"/>
-      <w:r>
-        <w:rPr>
-          <w:sz w:val="24"/>
-          <w:szCs w:val="24"/>
-        </w:rPr>
-        <w:t>.</w:t>
-      </w:r>
-    </w:p>
-    <w:p>
-      <w:pPr>
+        <w:spacing w:before="240"/>
         <w:rPr>
           <w:sz w:val="24"/>
           <w:szCs w:val="24"/>
@@ -5273,6 +5066,8 @@
         <w:t>: Leiden Communities</w:t>
       </w:r>
     </w:p>
+    <w:p/>
+    <w:p/>
     <w:p/>
     <w:p/>
     <w:p>
@@ -12272,6 +12067,7 @@
   <w:style w:type="character" w:default="1" w:styleId="Carpredefinitoparagrafo">
     <w:name w:val="Default Paragraph Font"/>
     <w:uiPriority w:val="1"/>
+    <w:semiHidden/>
     <w:unhideWhenUsed/>
   </w:style>
   <w:style w:type="table" w:default="1" w:styleId="Tabellanormale">

</xml_diff>